<commit_message>
Cambios articulo y copia con autores
</commit_message>
<xml_diff>
--- a/Articulo_Popayan/Articulo_RevistaCientifica_ES.docx
+++ b/Articulo_Popayan/Articulo_RevistaCientifica_ES.docx
@@ -1167,7 +1167,7 @@
               <a:graphicData uri="http://schemas.openxmlformats.org/drawingml/2006/picture">
                 <pic:pic>
                   <pic:nvPicPr>
-                    <pic:cNvPr descr="figuras/Figura_1.jpg" id="33" name="Picture"/>
+                    <pic:cNvPr descr="figuras/Figura1_DiversidadAlfa.jpg" id="33" name="Picture"/>
                     <pic:cNvPicPr>
                       <a:picLocks noChangeArrowheads="1" noChangeAspect="1"/>
                     </pic:cNvPicPr>
@@ -1269,7 +1269,7 @@
               <a:graphicData uri="http://schemas.openxmlformats.org/drawingml/2006/picture">
                 <pic:pic>
                   <pic:nvPicPr>
-                    <pic:cNvPr descr="figuras/Figura_2.jpg" id="37" name="Picture"/>
+                    <pic:cNvPr descr="figuras/Figura2_DiversidadBeta.jpg" id="37" name="Picture"/>
                     <pic:cNvPicPr>
                       <a:picLocks noChangeArrowheads="1" noChangeAspect="1"/>
                     </pic:cNvPicPr>
@@ -1371,7 +1371,7 @@
               <a:graphicData uri="http://schemas.openxmlformats.org/drawingml/2006/picture">
                 <pic:pic>
                   <pic:nvPicPr>
-                    <pic:cNvPr descr="figuras/Figura_3.jpg" id="41" name="Picture"/>
+                    <pic:cNvPr descr="figuras/Figura3_AbundanciaFilo.jpg" id="41" name="Picture"/>
                     <pic:cNvPicPr>
                       <a:picLocks noChangeArrowheads="1" noChangeAspect="1"/>
                     </pic:cNvPicPr>
@@ -1594,7 +1594,7 @@
               <a:graphicData uri="http://schemas.openxmlformats.org/drawingml/2006/picture">
                 <pic:pic>
                   <pic:nvPicPr>
-                    <pic:cNvPr descr="figuras/Figura_4.jpg" id="45" name="Picture"/>
+                    <pic:cNvPr descr="figuras/Figura4_ComposicionBacteriana.jpg" id="45" name="Picture"/>
                     <pic:cNvPicPr>
                       <a:picLocks noChangeArrowheads="1" noChangeAspect="1"/>
                     </pic:cNvPicPr>
@@ -1770,7 +1770,7 @@
               <a:graphicData uri="http://schemas.openxmlformats.org/drawingml/2006/picture">
                 <pic:pic>
                   <pic:nvPicPr>
-                    <pic:cNvPr descr="figuras/Figura_5.jpg" id="49" name="Picture"/>
+                    <pic:cNvPr descr="figuras/Figura5_tStudent_Fusarium.jpg" id="49" name="Picture"/>
                     <pic:cNvPicPr>
                       <a:picLocks noChangeArrowheads="1" noChangeAspect="1"/>
                     </pic:cNvPicPr>
@@ -1868,7 +1868,7 @@
               <a:graphicData uri="http://schemas.openxmlformats.org/drawingml/2006/picture">
                 <pic:pic>
                   <pic:nvPicPr>
-                    <pic:cNvPr descr="figuras/Figura_6.jpg" id="52" name="Picture"/>
+                    <pic:cNvPr descr="figuras/Figura6_Wilcoxon_Shannon.jpg" id="52" name="Picture"/>
                     <pic:cNvPicPr>
                       <a:picLocks noChangeArrowheads="1" noChangeAspect="1"/>
                     </pic:cNvPicPr>
@@ -2364,7 +2364,7 @@
         <w:pStyle w:val="BodyText"/>
       </w:pPr>
       <w:r>
-        <w:t xml:space="preserve">Los autores agradecen a Solena Ag por proporcionar los datos metagenómicos de cultivos de fresa utilizados en este estudio. Los agradecimientos institucionales y las fuentes de financiación se indicarán en la versión final del manuscrito para preservar el anonimato de la revisión.</w:t>
+        <w:t xml:space="preserve">Los autores agradecen a la empresa Solena Ag por facilitar los datos metagenómicos de cultivos de fresa utilizados en este estudio, y en particular a Obed Ramírez Sánchez, contacto principal con la empresa, por su gestión para la obtención de los datos y su apoyo en la interpretación de los resultados. Los agradecimientos institucionales y las fuentes de financiación se indicarán en la versión final del manuscrito para preservar el anonimato de la revisión.</w:t>
       </w:r>
     </w:p>
     <w:p>

</xml_diff>

<commit_message>
generacion y explicacion de redes, explicacion de rarefaccion y normalizacion, referenciacion de scripts, tallerpractica docente como objetivo
</commit_message>
<xml_diff>
--- a/Articulo_Popayan/Articulo_RevistaCientifica_ES.docx
+++ b/Articulo_Popayan/Articulo_RevistaCientifica_ES.docx
@@ -177,7 +177,23 @@
         <w:t xml:space="preserve"> </w:t>
       </w:r>
       <w:r>
-        <w:t xml:space="preserve">(35 saludables y 18 no saludables), tras un control de calidad que excluyó las muestras con menos de 25 millones de lecturas. El flujo, implementado en R y Bash con phyloseq, integró la conversión al formato BIOM, el cálculo de índices de diversidad alfa (Chao1, Shannon y Simpson) y beta (Bray-Curtis, Jaccard, Euclidiana, Manhattan y Jensen-Shannon), la exploración taxonómica por nivel jerárquico y pruebas de hipótesis (t de Student, Welch y Mann-Whitney). Las plantas saludables tendieron a una mayor diversidad y equilibrio, mientras que las no saludables presentaron mayor abundancia relativa de taxones asociados con enfermedad. Sin embargo, ninguna diferencia de diversidad fue significativa, ni en la comunidad completa ni en la fracción eucariota; solo la mayor heterogeneidad del grupo no saludable. El flujo propuesto es una base para desarrollar clasificadores del estado sanitario basados en biomarcadores microbianos.</w:t>
+        <w:t xml:space="preserve">(35 saludables y 18 no saludables), tras un control de calidad que excluyó las muestras con menos de 25 millones de lecturas. El flujo, implementado en R y Bash con phyloseq, integró la conversión al formato BIOM, el cálculo de índices de diversidad alfa (Chao1, Shannon y Simpson) y beta (Bray-Curtis, Jaccard, Euclidiana, Manhattan y Jensen-Shannon), la exploración taxonómica por nivel jerárquico y pruebas de hipótesis (t de Student, Welch y Mann-Whitney). Las plantas saludables tendieron a una mayor diversidad, pero ni esa tendencia ni la proporción de</w:t>
+      </w:r>
+      <w:r>
+        <w:t xml:space="preserve"> </w:t>
+      </w:r>
+      <w:r>
+        <w:rPr>
+          <w:iCs/>
+          <w:i/>
+        </w:rPr>
+        <w:t xml:space="preserve">Fusarium</w:t>
+      </w:r>
+      <w:r>
+        <w:t xml:space="preserve"> </w:t>
+      </w:r>
+      <w:r>
+        <w:t xml:space="preserve">o de otros géneros candidatos difirieron significativamente entre grupos; la única diferencia significativa fue la mayor heterogeneidad del grupo no saludable. El flujo propuesto es una base para desarrollar clasificadores del estado sanitario basados en biomarcadores microbianos.</w:t>
       </w:r>
     </w:p>
     <w:p>
@@ -238,7 +254,23 @@
         <w:t xml:space="preserve">Fragaria × ananassa</w:t>
       </w:r>
       <w:r>
-        <w:t xml:space="preserve">) and to identify patterns associated with plant health status. Fifty-three shotgun metagenomes (35 from healthy and 18 from unhealthy plants) were analyzed after a quality-control step that excluded samples with fewer than 25 million reads. The workflow, implemented in R and Bash with phyloseq, integrated conversion to the BIOM format, computation of alpha diversity indices (Chao1, Shannon, and Simpson) and beta diversity measures (Bray-Curtis, Jaccard, Euclidean, Manhattan, and Jensen-Shannon), taxonomic exploration by kingdom, phylum, family, genus, and species, and hypothesis testing (Student’s t, Welch, and Mann-Whitney). Healthy plants showed a trend toward higher diversity and a more balanced community, whereas unhealthy plants exhibited a higher relative abundance of disease-associated taxa. However, no diversity difference was statistically significant, neither in the whole community nor in the eukaryotic fraction; only the greater heterogeneity of the unhealthy group was. The proposed workflow provides a basis for developing plant-health classifiers based on microbial biomarkers.</w:t>
+        <w:t xml:space="preserve">) and to identify patterns associated with plant health status. Fifty-three shotgun metagenomes (35 from healthy and 18 from unhealthy plants) were analyzed after a quality-control step that excluded samples with fewer than 25 million reads. The workflow, implemented in R and Bash with phyloseq, integrated conversion to the BIOM format, computation of alpha diversity indices (Chao1, Shannon, and Simpson) and beta diversity measures (Bray-Curtis, Jaccard, Euclidean, Manhattan, and Jensen-Shannon), taxonomic exploration by kingdom, phylum, family, genus, and species, and hypothesis testing (Student’s t, Welch, and Mann-Whitney). Healthy plants showed a trend toward higher diversity, but neither that trend nor the proportion of</w:t>
+      </w:r>
+      <w:r>
+        <w:t xml:space="preserve"> </w:t>
+      </w:r>
+      <w:r>
+        <w:rPr>
+          <w:iCs/>
+          <w:i/>
+        </w:rPr>
+        <w:t xml:space="preserve">Fusarium</w:t>
+      </w:r>
+      <w:r>
+        <w:t xml:space="preserve"> </w:t>
+      </w:r>
+      <w:r>
+        <w:t xml:space="preserve">or of other candidate genera differed significantly between groups; the only significant difference was the greater heterogeneity of the unhealthy group. The proposed workflow provides a basis for developing plant-health classifiers based on microbial biomarkers.</w:t>
       </w:r>
     </w:p>
     <w:p>
@@ -315,7 +347,23 @@
         <w:t xml:space="preserve"> </w:t>
       </w:r>
       <w:r>
-        <w:t xml:space="preserve">(35 de plantas saudáveis e 18 não saudáveis), após um controle de qualidade que excluiu as amostras com menos de 25 milhões de leituras. O fluxo, implementado em R e Bash com phyloseq, integrou a conversão ao formato BIOM, o cálculo de índices de diversidade alfa (Chao1, Shannon e Simpson) e beta (Bray-Curtis, Jaccard, Euclidiana, Manhattan e Jensen-Shannon), a exploração taxonômica por nível hierárquico e testes de hipóteses (t de Student, Welch e Mann-Whitney). As plantas saudáveis tenderam a maior diversidade e equilíbrio, enquanto as não saudáveis apresentaram maior abundância relativa de táxons associados a doenças. No entanto, nenhuma diferença de diversidade foi significativa, nem na comunidade completa nem na fração eucariótica; apenas a maior heterogeneidade do grupo não saudável o foi. O fluxo proposto é uma base para desenvolver classificadores do estado sanitário baseados em biomarcadores microbianos.</w:t>
+        <w:t xml:space="preserve">(35 de plantas saudáveis e 18 não saudáveis), após um controle de qualidade que excluiu as amostras com menos de 25 milhões de leituras. O fluxo, implementado em R e Bash com phyloseq, integrou a conversão ao formato BIOM, o cálculo de índices de diversidade alfa (Chao1, Shannon e Simpson) e beta (Bray-Curtis, Jaccard, Euclidiana, Manhattan e Jensen-Shannon), a exploração taxonômica por nível hierárquico e testes de hipóteses (t de Student, Welch e Mann-Whitney). As plantas saudáveis tenderam a maior diversidade, mas nem essa tendência nem a proporção de</w:t>
+      </w:r>
+      <w:r>
+        <w:t xml:space="preserve"> </w:t>
+      </w:r>
+      <w:r>
+        <w:rPr>
+          <w:iCs/>
+          <w:i/>
+        </w:rPr>
+        <w:t xml:space="preserve">Fusarium</w:t>
+      </w:r>
+      <w:r>
+        <w:t xml:space="preserve"> </w:t>
+      </w:r>
+      <w:r>
+        <w:t xml:space="preserve">ou de outros gêneros candidatos diferiram significativamente entre os grupos; a única diferença significativa foi a maior heterogeneidade do grupo não saudável. O fluxo proposto é uma base para desenvolver classificadores do estado sanitário baseados em biomarcadores microbianos.</w:t>
       </w:r>
     </w:p>
     <w:p>
@@ -413,7 +461,7 @@
         <w:t xml:space="preserve">Fragaria × ananassa</w:t>
       </w:r>
       <w:r>
-        <w:t xml:space="preserve">) es uno de los cultivos frutales de mayor relevancia comercial y nutricional en el mundo, pero su producción es particularmente sensible a enfermedades fúngicas y bacterianas del suelo, así como a las prácticas agrícolas y a las condiciones ambientales. En los últimos años, varios estudios han documentado diferencias taxonómicas consistentes entre rizósferas de fresa saludables y no saludables: géneros como</w:t>
+        <w:t xml:space="preserve">) es uno de los cultivos frutales de mayor relevancia comercial y nutricional en el mundo, pero su producción es particularmente sensible a enfermedades fúngicas y bacterianas del suelo, así como a las prácticas agrícolas y a las condiciones ambientales. Varios estudios han documentado diferencias taxonómicas entre rizósferas de fresa saludables y no saludables: géneros como</w:t>
       </w:r>
       <w:r>
         <w:t xml:space="preserve"> </w:t>
@@ -442,7 +490,10 @@
         <w:t xml:space="preserve">Solibacter</w:t>
       </w:r>
       <w:r>
-        <w:t xml:space="preserve">, junto con la familia Nitrosomonadaceae, tienden a ser más abundantes en rizósferas no saludables, mientras que taxones como Tepidisphaerales e</w:t>
+        <w:t xml:space="preserve"> </w:t>
+      </w:r>
+      <w:r>
+        <w:t xml:space="preserve">tienden a ser más abundantes en rizósferas no saludables, mientras que Tepidisphaerales e</w:t>
       </w:r>
       <w:r>
         <w:t xml:space="preserve"> </w:t>
@@ -458,7 +509,7 @@
         <w:t xml:space="preserve"> </w:t>
       </w:r>
       <w:r>
-        <w:t xml:space="preserve">se asocian con condiciones saludables (Siegieda et al., 2024). Asimismo, se ha reportado que consorcios de rizobacterias promotoras del crecimiento vegetal (PGPR), como</w:t>
+        <w:t xml:space="preserve">se asocian con condiciones saludables (Siegieda et al., 2024); las rizobacterias promotoras del crecimiento vegetal (PGPR), como</w:t>
       </w:r>
       <w:r>
         <w:t xml:space="preserve"> </w:t>
@@ -471,6 +522,35 @@
         <w:t xml:space="preserve">Bacillus subtilis</w:t>
       </w:r>
       <w:r>
+        <w:t xml:space="preserve"> </w:t>
+      </w:r>
+      <w:r>
+        <w:t xml:space="preserve">y</w:t>
+      </w:r>
+      <w:r>
+        <w:t xml:space="preserve"> </w:t>
+      </w:r>
+      <w:r>
+        <w:rPr>
+          <w:iCs/>
+          <w:i/>
+        </w:rPr>
+        <w:t xml:space="preserve">Pseudomonas monteilii</w:t>
+      </w:r>
+      <w:r>
+        <w:t xml:space="preserve">, mejoran el microbioma del suelo y la calidad del fruto (Nam et al., 2023); y fitopatógenos como</w:t>
+      </w:r>
+      <w:r>
+        <w:t xml:space="preserve"> </w:t>
+      </w:r>
+      <w:r>
+        <w:rPr>
+          <w:iCs/>
+          <w:i/>
+        </w:rPr>
+        <w:t xml:space="preserve">Fusarium</w:t>
+      </w:r>
+      <w:r>
         <w:t xml:space="preserve">,</w:t>
       </w:r>
       <w:r>
@@ -481,58 +561,13 @@
           <w:iCs/>
           <w:i/>
         </w:rPr>
-        <w:t xml:space="preserve">Bacillus amyloliquefaciens</w:t>
-      </w:r>
-      <w:r>
-        <w:t xml:space="preserve"> </w:t>
-      </w:r>
-      <w:r>
-        <w:t xml:space="preserve">y</w:t>
-      </w:r>
-      <w:r>
-        <w:t xml:space="preserve"> </w:t>
-      </w:r>
-      <w:r>
-        <w:rPr>
-          <w:iCs/>
-          <w:i/>
-        </w:rPr>
-        <w:t xml:space="preserve">Pseudomonas monteilii</w:t>
-      </w:r>
-      <w:r>
-        <w:t xml:space="preserve">, modifican favorablemente el microbioma del suelo y la calidad del fruto (Nam et al., 2023), mientras que microorganismos fitopatógenos como</w:t>
-      </w:r>
-      <w:r>
-        <w:t xml:space="preserve"> </w:t>
-      </w:r>
-      <w:r>
-        <w:rPr>
-          <w:iCs/>
-          <w:i/>
-        </w:rPr>
-        <w:t xml:space="preserve">Fusarium</w:t>
-      </w:r>
-      <w:r>
-        <w:t xml:space="preserve"> </w:t>
-      </w:r>
-      <w:r>
-        <w:t xml:space="preserve">spp.,</w:t>
-      </w:r>
-      <w:r>
-        <w:t xml:space="preserve"> </w:t>
-      </w:r>
-      <w:r>
-        <w:rPr>
-          <w:iCs/>
-          <w:i/>
-        </w:rPr>
         <w:t xml:space="preserve">Phytophthora</w:t>
       </w:r>
       <w:r>
         <w:t xml:space="preserve"> </w:t>
       </w:r>
       <w:r>
-        <w:t xml:space="preserve">spp. o</w:t>
+        <w:t xml:space="preserve">o</w:t>
       </w:r>
       <w:r>
         <w:t xml:space="preserve"> </w:t>
@@ -548,15 +583,15 @@
         <w:t xml:space="preserve"> </w:t>
       </w:r>
       <w:r>
-        <w:t xml:space="preserve">se han vinculado de manera recurrente con procesos de marchitez y pudrición radicular en este cultivo (Yang et al., 2020).</w:t>
-      </w:r>
-    </w:p>
-    <w:p>
-      <w:pPr>
-        <w:pStyle w:val="BodyText"/>
-      </w:pPr>
-      <w:r>
-        <w:t xml:space="preserve">Estos hallazgos plantean una pregunta metodológica de fondo: ¿en qué medida las herramientas estadísticas convencionales, es decir, los índices de diversidad y la inferencia basada en pruebas de hipótesis, permiten capturar y validar formalmente las diferencias observadas a nivel taxonómico, considerando el tamaño de muestra moderado, la alta dimensionalidad y la naturaleza composicional propios de los estudios metagenómicos agrícolas? Responder esta pregunta exige no solo calcular los índices convencionales de diversidad alfa y beta, sino también evaluar su capacidad discriminante mediante pruebas de hipótesis paramétricas y no paramétricas, y explorar la estructura de los datos en distintos niveles jerárquicos de la taxonomía, desde el reino hasta la especie.</w:t>
+        <w:t xml:space="preserve">se vinculan con la marchitez y la pudrición radicular (Yang et al., 2020).</w:t>
+      </w:r>
+    </w:p>
+    <w:p>
+      <w:pPr>
+        <w:pStyle w:val="BodyText"/>
+      </w:pPr>
+      <w:r>
+        <w:t xml:space="preserve">Estos hallazgos plantean una pregunta metodológica: ¿en qué medida los índices de diversidad y las pruebas de hipótesis convencionales permiten validar formalmente las diferencias observadas, dados el tamaño de muestra moderado, la alta dimensionalidad y la naturaleza composicional de los estudios metagenómicos agrícolas? Responderla exige evaluar la capacidad discriminante de los índices con pruebas paramétricas y no paramétricas, y explorar los datos en distintos niveles de la taxonomía, desde el reino hasta la especie.</w:t>
       </w:r>
     </w:p>
     <w:p>
@@ -617,7 +652,7 @@
         <w:pStyle w:val="BodyText"/>
       </w:pPr>
       <w:r>
-        <w:t xml:space="preserve">La estructura de datos central es el objeto phyloseq (McMurdie y Holmes, 2013), un contenedor que integra de manera coherente cuatro componentes: la matriz de conteos (taxón × muestra), la tabla de taxonomía, que codifica la jerarquía reino → filo → clase → orden → familia → género → especie, los metadatos de las muestras y, cuando está disponible, el árbol filogenético. La matriz de conteos, altamente dispersa, se almacena e intercambia mediante el formato BIOM (</w:t>
+        <w:t xml:space="preserve">La estructura de datos central es el objeto phyloseq (McMurdie y Holmes, 2013), que integra la matriz de conteos (taxón × muestra), la tabla de taxonomía con la jerarquía de reino a especie, los metadatos de las muestras y, cuando existe, el árbol filogenético. La matriz de conteos, altamente dispersa, se almacena en el formato BIOM (</w:t>
       </w:r>
       <w:r>
         <w:rPr>
@@ -627,7 +662,7 @@
         <w:t xml:space="preserve">Biological Observation Matrix</w:t>
       </w:r>
       <w:r>
-        <w:t xml:space="preserve">; McDonald et al., 2012), un estándar basado en JSON o HDF5 optimizado para matrices de observaciones biológicas de gran tamaño. El cálculo de la diversidad beta es cuadrático en el número de muestras, del orden de O(n²·p) para n muestras y p taxones, lo que motiva las decisiones de filtrado y aglomeración adoptadas.</w:t>
+        <w:t xml:space="preserve">; McDonald et al., 2012). El cálculo de la diversidad beta es cuadrático en el número de muestras, del orden de O(n²·p), lo que motiva las decisiones de filtrado y aglomeración adoptadas.</w:t>
       </w:r>
     </w:p>
     <w:p>
@@ -1301,7 +1336,101 @@
         <w:t xml:space="preserve">Fusarium</w:t>
       </w:r>
       <w:r>
-        <w:t xml:space="preserve">, dada su relevancia documentada como fitopatógeno de la fresa. Como complemento no paramétrico, y dado que el supuesto de normalidad no siempre pudo garantizarse, se aplicó la prueba de suma de rangos de Wilcoxon para dos muestras independientes, equivalente a la prueba U de Mann-Whitney (Mann y Whitney, 1947; Wilcoxon, 1945), para comparar las distribuciones del índice de Shannon entre ambos grupos. La normalidad de cada grupo se verificó con la prueba de Shapiro-Wilk y la igualdad de varianzas con la prueba F. En todos los casos se utilizó un nivel de significancia α = 0.05.</w:t>
+        <w:t xml:space="preserve">, dada su relevancia documentada como fitopatógeno de la fresa. Como complemento no paramétrico, y dado que el supuesto de normalidad no siempre pudo garantizarse, se aplicó la prueba de suma de rangos de Wilcoxon para dos muestras independientes, equivalente a la prueba U de Mann-Whitney (Mann y Whitney, 1947; Wilcoxon, 1945), para comparar las distribuciones del índice de Shannon entre ambos grupos. La normalidad de cada grupo se verificó con la prueba de Shapiro-Wilk y la igualdad de varianzas con la prueba F. Adicionalmente, se comparó entre grupos el porcentaje de lecturas clasificadas asignadas a</w:t>
+      </w:r>
+      <w:r>
+        <w:t xml:space="preserve"> </w:t>
+      </w:r>
+      <w:r>
+        <w:rPr>
+          <w:iCs/>
+          <w:i/>
+        </w:rPr>
+        <w:t xml:space="preserve">Fusarium</w:t>
+      </w:r>
+      <w:r>
+        <w:t xml:space="preserve"> </w:t>
+      </w:r>
+      <w:r>
+        <w:t xml:space="preserve">y a seis géneros candidatos (</w:t>
+      </w:r>
+      <w:r>
+        <w:rPr>
+          <w:iCs/>
+          <w:i/>
+        </w:rPr>
+        <w:t xml:space="preserve">Phytophthora</w:t>
+      </w:r>
+      <w:r>
+        <w:t xml:space="preserve">,</w:t>
+      </w:r>
+      <w:r>
+        <w:t xml:space="preserve"> </w:t>
+      </w:r>
+      <w:r>
+        <w:rPr>
+          <w:iCs/>
+          <w:i/>
+        </w:rPr>
+        <w:t xml:space="preserve">Ralstonia</w:t>
+      </w:r>
+      <w:r>
+        <w:t xml:space="preserve">,</w:t>
+      </w:r>
+      <w:r>
+        <w:t xml:space="preserve"> </w:t>
+      </w:r>
+      <w:r>
+        <w:rPr>
+          <w:iCs/>
+          <w:i/>
+        </w:rPr>
+        <w:t xml:space="preserve">Pseudomonas</w:t>
+      </w:r>
+      <w:r>
+        <w:t xml:space="preserve">,</w:t>
+      </w:r>
+      <w:r>
+        <w:t xml:space="preserve"> </w:t>
+      </w:r>
+      <w:r>
+        <w:rPr>
+          <w:iCs/>
+          <w:i/>
+        </w:rPr>
+        <w:t xml:space="preserve">Bacillus</w:t>
+      </w:r>
+      <w:r>
+        <w:t xml:space="preserve">,</w:t>
+      </w:r>
+      <w:r>
+        <w:t xml:space="preserve"> </w:t>
+      </w:r>
+      <w:r>
+        <w:rPr>
+          <w:iCs/>
+          <w:i/>
+        </w:rPr>
+        <w:t xml:space="preserve">Streptomyces</w:t>
+      </w:r>
+      <w:r>
+        <w:t xml:space="preserve"> </w:t>
+      </w:r>
+      <w:r>
+        <w:t xml:space="preserve">y</w:t>
+      </w:r>
+      <w:r>
+        <w:t xml:space="preserve"> </w:t>
+      </w:r>
+      <w:r>
+        <w:rPr>
+          <w:iCs/>
+          <w:i/>
+        </w:rPr>
+        <w:t xml:space="preserve">Paenibacillus</w:t>
+      </w:r>
+      <w:r>
+        <w:t xml:space="preserve">) con la prueba de Mann-Whitney, ajustando los valores p por comparaciones múltiples con el método de Benjamini-Hochberg (Benjamini &amp; Hochberg, 1995). En todos los casos se utilizó un nivel de significancia α = 0.05.</w:t>
       </w:r>
     </w:p>
     <w:bookmarkEnd w:id="29"/>
@@ -1349,7 +1478,7 @@
         <w:pStyle w:val="FirstParagraph"/>
       </w:pPr>
       <w:r>
-        <w:t xml:space="preserve">Antes de aplicar el filtro de calidad, la diversidad alfa observada en los cuatro índices (riqueza observada, Chao1, Shannon y Simpson) era prácticamente indistinguible entre los grupos saludable y no saludable, debido a la influencia de un número reducido de muestras con profundidades de secuenciación extremadamente bajas, que comprimían visualmente la escala de todos los gráficos (Figura 1A). Tras eliminar las cinco muestras de baja calidad, la separación entre grupos se hizo considerablemente más clara (Figura 1B): las muestras saludables mostraron una tendencia hacia una mayor diversidad, particularmente evidente en el estimador Chao1, que al incorporar los conteos de</w:t>
+        <w:t xml:space="preserve">Antes del filtro de calidad, la diversidad alfa en los cuatro índices (riqueza observada, Chao1, Shannon y Simpson) era indistinguible entre grupos, porque unas pocas muestras con profundidad muy baja comprimían la escala de los gráficos (Figura 1A). Tras eliminar las cinco muestras de baja calidad (Figura 1B), las muestras saludables mostraron una tendencia hacia mayor diversidad, más evidente en el estimador Chao1, que usa los conteos de</w:t>
       </w:r>
       <w:r>
         <w:t xml:space="preserve"> </w:t>
@@ -1381,7 +1510,7 @@
         <w:t xml:space="preserve"> </w:t>
       </w:r>
       <w:r>
-        <w:t xml:space="preserve">para estimar la riqueza total permitió apreciar con mayor nitidez la diferencia de riqueza entre grupos. Aunque perceptible, la diferencia no fue grande, lo que anticipó los resultados de las pruebas de hipótesis.</w:t>
+        <w:t xml:space="preserve">para estimar la riqueza total. La diferencia, aunque perceptible, fue pequeña, lo que anticipó los resultados de las pruebas de hipótesis.</w:t>
       </w:r>
     </w:p>
     <w:p>
@@ -1687,7 +1816,7 @@
         <w:pStyle w:val="FirstParagraph"/>
       </w:pPr>
       <w:r>
-        <w:t xml:space="preserve">Desagregar el análisis por reino y por nivel taxonómico hizo evidentes patrones que no eran discernibles a nivel de la comunidad completa. Dentro del subconjunto Eukaryota se observó una menor abundancia relativa del filo Oomycota en las muestras no saludables respecto a las saludables, así como una disminución específica de la familia Peronosporaceae en las muestras no saludables. En niveles más finos (género y especie), la exploración taxonómica identificó taxones eucariotas, entre ellos</w:t>
+        <w:t xml:space="preserve">Desagregar el análisis por reino y por nivel taxonómico hizo evidentes patrones que no eran discernibles a nivel de la comunidad completa. Dentro del subconjunto Eukaryota se observó una menor abundancia relativa del filo Oomycota en las muestras no saludables respecto a las saludables, así como una disminución específica de la familia Peronosporaceae en las muestras no saludables. En niveles más finos (género y especie) la exploración identificó a los fitopatógenos</w:t>
       </w:r>
       <w:r>
         <w:t xml:space="preserve"> </w:t>
@@ -1716,7 +1845,10 @@
         <w:t xml:space="preserve">Phytophthora</w:t>
       </w:r>
       <w:r>
-        <w:t xml:space="preserve">, con mayor presencia relativa en las muestras no saludables, en concordancia con su papel documentado como fitopatógenos de la fresa (Yang et al., 2020).</w:t>
+        <w:t xml:space="preserve"> </w:t>
+      </w:r>
+      <w:r>
+        <w:t xml:space="preserve">(Yang et al., 2020), cuya proporción se contrasta formalmente entre grupos más adelante.</w:t>
       </w:r>
     </w:p>
     <w:p>
@@ -1766,7 +1898,7 @@
         <w:t xml:space="preserve">Paenibacillus polymyxa</w:t>
       </w:r>
       <w:r>
-        <w:t xml:space="preserve">, un microorganismo ampliamente documentado como rizobacteria promotora del crecimiento vegetal y agente de biocontrol, cuya presencia relativa mostró un patrón más definido en las muestras saludables (Figura 4). En concordancia con reportes previos en fresa, la exploración taxonómica también identificó una mayor presencia relativa de géneros con potencial patogénico, como</w:t>
+        <w:t xml:space="preserve">, un microorganismo ampliamente documentado como rizobacteria promotora del crecimiento vegetal y agente de biocontrol, presente en muestras aisladas de ambos grupos (Figura 4). La inspección de las gráficas sugería además una mayor presencia de</w:t>
       </w:r>
       <w:r>
         <w:t xml:space="preserve"> </w:t>
@@ -1779,7 +1911,10 @@
         <w:t xml:space="preserve">Ralstonia</w:t>
       </w:r>
       <w:r>
-        <w:t xml:space="preserve">, en muestras no saludables, y de géneros benéficos, como</w:t>
+        <w:t xml:space="preserve"> </w:t>
+      </w:r>
+      <w:r>
+        <w:t xml:space="preserve">en las muestras no saludables y de</w:t>
       </w:r>
       <w:r>
         <w:t xml:space="preserve"> </w:t>
@@ -1808,7 +1943,10 @@
         <w:t xml:space="preserve">Bacillus</w:t>
       </w:r>
       <w:r>
-        <w:t xml:space="preserve">, en muestras saludables (Nam et al., 2023; Siegieda et al., 2024).</w:t>
+        <w:t xml:space="preserve"> </w:t>
+      </w:r>
+      <w:r>
+        <w:t xml:space="preserve">en las saludables, en línea con reportes previos en fresa (Nam et al., 2023; Siegieda et al., 2024); la comparación cuantitativa de esas proporciones, presentada en la sección de pruebas de hipótesis, no confirmó esas impresiones.</w:t>
       </w:r>
     </w:p>
     <w:p>
@@ -1924,7 +2062,7 @@
         <w:t xml:space="preserve"> </w:t>
       </w:r>
       <w:r>
-        <w:t xml:space="preserve">como taxones distintivos. D) Especie: presencia diferenciada de</w:t>
+        <w:t xml:space="preserve">como taxones distintivos. D) Especie:</w:t>
       </w:r>
       <w:r>
         <w:t xml:space="preserve"> </w:t>
@@ -1937,15 +2075,18 @@
         <w:t xml:space="preserve">Paenibacillus polymyxa</w:t>
       </w:r>
       <w:r>
-        <w:t xml:space="preserve">. Elaboración propia a partir de datos de Solena Ag.</w:t>
-      </w:r>
-    </w:p>
-    <w:p>
-      <w:pPr>
-        <w:pStyle w:val="BodyText"/>
-      </w:pPr>
-      <w:r>
-        <w:t xml:space="preserve">En cuanto a la diversidad, tanto alfa como beta, calculada dentro de cada nivel taxonómico, la diversidad alfa de Eukaryota reveló una microbiota más equilibrada en las plantas saludables frente a una mayor dominancia de taxones potencialmente patógenos en las no saludables, mientras que la diversidad alfa de Bacteria mostró un patrón similar, con mayor diversidad y equilibrio en las muestras saludables en todos los niveles taxonómicos evaluados. Respecto a la diversidad beta por nivel taxonómico, ninguna de las particiones (filo, familia, género, especie) logró una separación completa entre grupos; sin embargo, la medida de Bray-Curtis mostró diferencias composicionales más evidentes precisamente en los niveles más finos (género y especie), lo que refuerza el valor de la desagregación taxonómica para identificar biomarcadores candidatos.</w:t>
+        <w:t xml:space="preserve"> </w:t>
+      </w:r>
+      <w:r>
+        <w:t xml:space="preserve">en muestras aisladas. Elaboración propia a partir de datos de Solena Ag.</w:t>
+      </w:r>
+    </w:p>
+    <w:p>
+      <w:pPr>
+        <w:pStyle w:val="BodyText"/>
+      </w:pPr>
+      <w:r>
+        <w:t xml:space="preserve">En cuanto a la diversidad, tanto alfa como beta, calculada dentro de cada nivel taxonómico, tanto la diversidad alfa de Eukaryota como la de Bacteria mostraron una tendencia hacia mayor riqueza en las muestras saludables en todos los niveles taxonómicos evaluados, sin separación entre grupos. Respecto a la diversidad beta por nivel taxonómico, ninguna de las particiones (filo, familia, género, especie) logró una separación completa entre grupos; sin embargo, la medida de Bray-Curtis mostró diferencias composicionales más evidentes precisamente en los niveles más finos (género y especie), aunque tampoco con una separación entre grupos.</w:t>
       </w:r>
     </w:p>
     <w:bookmarkEnd w:id="46"/>
@@ -2103,6 +2244,120 @@
     </w:p>
     <w:p>
       <w:pPr>
+        <w:pStyle w:val="BodyText"/>
+      </w:pPr>
+      <w:r>
+        <w:t xml:space="preserve">La comparación directa de las proporciones tampoco reveló géneros asociados con el estado de salud.</w:t>
+      </w:r>
+      <w:r>
+        <w:t xml:space="preserve"> </w:t>
+      </w:r>
+      <w:r>
+        <w:rPr>
+          <w:iCs/>
+          <w:i/>
+        </w:rPr>
+        <w:t xml:space="preserve">Fusarium</w:t>
+      </w:r>
+      <w:r>
+        <w:t xml:space="preserve"> </w:t>
+      </w:r>
+      <w:r>
+        <w:t xml:space="preserve">representó en promedio el 0.136 % de las lecturas clasificadas en las plantas saludables y el 0.151 % en las no saludables, con medianas de 0.119 % y 0.127 % y distribuciones casi idénticas (U = 317 de 630 pares posibles, p = 0.978); dentro de la fracción eucariota fue el género dominante en ambos grupos, con el 21.1 % y el 22.3 % de las lecturas (p = 0.889). Para</w:t>
+      </w:r>
+      <w:r>
+        <w:t xml:space="preserve"> </w:t>
+      </w:r>
+      <w:r>
+        <w:rPr>
+          <w:iCs/>
+          <w:i/>
+        </w:rPr>
+        <w:t xml:space="preserve">Pseudomonas</w:t>
+      </w:r>
+      <w:r>
+        <w:t xml:space="preserve">,</w:t>
+      </w:r>
+      <w:r>
+        <w:t xml:space="preserve"> </w:t>
+      </w:r>
+      <w:r>
+        <w:rPr>
+          <w:iCs/>
+          <w:i/>
+        </w:rPr>
+        <w:t xml:space="preserve">Bacillus</w:t>
+      </w:r>
+      <w:r>
+        <w:t xml:space="preserve">,</w:t>
+      </w:r>
+      <w:r>
+        <w:t xml:space="preserve"> </w:t>
+      </w:r>
+      <w:r>
+        <w:rPr>
+          <w:iCs/>
+          <w:i/>
+        </w:rPr>
+        <w:t xml:space="preserve">Streptomyces</w:t>
+      </w:r>
+      <w:r>
+        <w:t xml:space="preserve"> </w:t>
+      </w:r>
+      <w:r>
+        <w:t xml:space="preserve">y</w:t>
+      </w:r>
+      <w:r>
+        <w:t xml:space="preserve"> </w:t>
+      </w:r>
+      <w:r>
+        <w:rPr>
+          <w:iCs/>
+          <w:i/>
+        </w:rPr>
+        <w:t xml:space="preserve">Ralstonia</w:t>
+      </w:r>
+      <w:r>
+        <w:t xml:space="preserve"> </w:t>
+      </w:r>
+      <w:r>
+        <w:t xml:space="preserve">las medianas de ambos grupos difirieron en menos del 10 % y ningún valor p se aproximó a la significancia; la media de</w:t>
+      </w:r>
+      <w:r>
+        <w:t xml:space="preserve"> </w:t>
+      </w:r>
+      <w:r>
+        <w:rPr>
+          <w:iCs/>
+          <w:i/>
+        </w:rPr>
+        <w:t xml:space="preserve">Paenibacillus</w:t>
+      </w:r>
+      <w:r>
+        <w:t xml:space="preserve"> </w:t>
+      </w:r>
+      <w:r>
+        <w:t xml:space="preserve">en el grupo no saludable estuvo inflada por una sola muestra. El único género con diferencia nominal fue</w:t>
+      </w:r>
+      <w:r>
+        <w:t xml:space="preserve"> </w:t>
+      </w:r>
+      <w:r>
+        <w:rPr>
+          <w:iCs/>
+          <w:i/>
+        </w:rPr>
+        <w:t xml:space="preserve">Phytophthora</w:t>
+      </w:r>
+      <w:r>
+        <w:t xml:space="preserve"> </w:t>
+      </w:r>
+      <w:r>
+        <w:t xml:space="preserve">(0.060 % frente a 0.055 %, p = 0.013), en la dirección contraria a la esperada para un patógeno y con p ajustado de 0.10. Las diferencias que sugerían las gráficas de barras eran efectos de la escala, de la aglomeración y de unas pocas muestras atípicas.</w:t>
+      </w:r>
+    </w:p>
+    <w:p>
+      <w:pPr>
         <w:spacing w:before="120" w:after="60"/>
         <w:jc w:val="center"/>
       </w:pPr>
@@ -2202,7 +2457,7 @@
         <w:pStyle w:val="BodyText"/>
       </w:pPr>
       <w:r>
-        <w:t xml:space="preserve">Los resultados de este trabajo muestran un patrón frecuente en el análisis estadístico de microbiomas agrícolas: la existencia de tendencias biológicas consistentes y de patrones taxonómicos diferenciadores plausibles que, sin embargo, no siempre alcanzan significancia estadística cuando se evalúan mediante índices agregados a nivel de la comunidad completa. Las plantas saludables mostraron, de manera consistente en los distintos análisis, una mayor diversidad y un mayor equilibrio microbiano, tanto en la diversidad alfa global como en la calculada por nivel taxonómico, mientras que las plantas no saludables exhibieron una mayor presencia relativa de taxones potencialmente asociados con enfermedad, como</w:t>
+        <w:t xml:space="preserve">Los resultados de este trabajo muestran un patrón frecuente en el análisis estadístico de microbiomas agrícolas: la existencia de tendencias biológicas visualmente plausibles que no alcanzan significancia estadística cuando se contrastan formalmente. Las plantas saludables mostraron, de manera consistente en los distintos análisis, una mayor diversidad y un mayor equilibrio microbiano, tanto en la diversidad alfa global como en la calculada por nivel taxonómico, mientras que la proporción de</w:t>
       </w:r>
       <w:r>
         <w:t xml:space="preserve"> </w:t>
@@ -2215,86 +2470,18 @@
         <w:t xml:space="preserve">Fusarium</w:t>
       </w:r>
       <w:r>
-        <w:t xml:space="preserve">,</w:t>
-      </w:r>
-      <w:r>
-        <w:t xml:space="preserve"> </w:t>
-      </w:r>
-      <w:r>
-        <w:rPr>
-          <w:iCs/>
-          <w:i/>
-        </w:rPr>
-        <w:t xml:space="preserve">Phytophthora</w:t>
-      </w:r>
-      <w:r>
-        <w:t xml:space="preserve"> </w:t>
-      </w:r>
-      <w:r>
-        <w:t xml:space="preserve">y</w:t>
-      </w:r>
-      <w:r>
-        <w:t xml:space="preserve"> </w:t>
-      </w:r>
-      <w:r>
-        <w:rPr>
-          <w:iCs/>
-          <w:i/>
-        </w:rPr>
-        <w:t xml:space="preserve">Ralstonia</w:t>
-      </w:r>
-      <w:r>
-        <w:t xml:space="preserve">, y una menor presencia de taxones como Oomycota, Peronosporaceae,</w:t>
-      </w:r>
-      <w:r>
-        <w:t xml:space="preserve"> </w:t>
-      </w:r>
-      <w:r>
-        <w:rPr>
-          <w:iCs/>
-          <w:i/>
-        </w:rPr>
-        <w:t xml:space="preserve">Pseudomonas</w:t>
-      </w:r>
-      <w:r>
-        <w:t xml:space="preserve">,</w:t>
-      </w:r>
-      <w:r>
-        <w:t xml:space="preserve"> </w:t>
-      </w:r>
-      <w:r>
-        <w:rPr>
-          <w:iCs/>
-          <w:i/>
-        </w:rPr>
-        <w:t xml:space="preserve">Bacillus</w:t>
-      </w:r>
-      <w:r>
-        <w:t xml:space="preserve"> </w:t>
-      </w:r>
-      <w:r>
-        <w:t xml:space="preserve">y</w:t>
-      </w:r>
-      <w:r>
-        <w:t xml:space="preserve"> </w:t>
-      </w:r>
-      <w:r>
-        <w:rPr>
-          <w:iCs/>
-          <w:i/>
-        </w:rPr>
-        <w:t xml:space="preserve">Paenibacillus</w:t>
-      </w:r>
-      <w:r>
-        <w:t xml:space="preserve">. No obstante, ni la diversidad alfa ni la beta globales permitieron una separación estadísticamente robusta entre grupos, y las pruebas t de Student y de Mann-Whitney sobre el índice de Shannon de la comunidad completa no alcanzaron significancia al nivel α = 0.05.</w:t>
-      </w:r>
-    </w:p>
-    <w:p>
-      <w:pPr>
-        <w:pStyle w:val="BodyText"/>
-      </w:pPr>
-      <w:r>
-        <w:t xml:space="preserve">Esta aparente contradicción entre la tendencia descriptiva y la falta de significancia estadística global admite varias explicaciones no excluyentes. En primer lugar, la naturaleza composicional y de alta dimensión de los datos metagenómicos implica que un único índice, calculado sobre miles de taxones simultáneamente, puede diluir señales biológicas presentes solo en un subconjunto reducido de taxones; en este caso, sin embargo, aislar la fracción eucariota, que incluye a</w:t>
+        <w:t xml:space="preserve"> </w:t>
+      </w:r>
+      <w:r>
+        <w:t xml:space="preserve">y de los géneros candidatos resultó prácticamente igual en ambos grupos. Además, ni la diversidad alfa ni la beta globales permitieron una separación estadísticamente robusta entre grupos, y las pruebas t de Student y de Mann-Whitney sobre el índice de Shannon de la comunidad completa no alcanzaron significancia al nivel α = 0.05.</w:t>
+      </w:r>
+    </w:p>
+    <w:p>
+      <w:pPr>
+        <w:pStyle w:val="BodyText"/>
+      </w:pPr>
+      <w:r>
+        <w:t xml:space="preserve">Esta aparente contradicción entre la tendencia descriptiva y la falta de significancia estadística global admite varias explicaciones no excluyentes. En primer lugar, la naturaleza composicional y de alta dimensión de los datos metagenómicos implica que un único índice, calculado sobre miles de taxones simultáneamente, puede diluir señales biológicas presentes solo en un subconjunto reducido de taxones; en este caso, sin embargo, ni aislar la fracción eucariota ni comparar directamente las proporciones de</w:t>
       </w:r>
       <w:r>
         <w:t xml:space="preserve"> </w:t>
@@ -2307,65 +2494,18 @@
         <w:t xml:space="preserve">Fusarium</w:t>
       </w:r>
       <w:r>
-        <w:t xml:space="preserve">, tampoco reveló una diferencia significativa, lo que sugiere que la señal, si existe, está en taxones concretos y no en la diversidad agregada de ningún reino. En segundo lugar, el tamaño de muestra y su desbalance (35 muestras saludables frente a 18 no saludables), junto con la diferencia observada en la profundidad de secuenciación entre grupos, reducen la potencia estadística disponible para detectar diferencias moderadas. En tercer lugar, los microbiomas rizosféricos están sujetos a fuentes de variabilidad no controladas en este estudio, como los lotes de cultivo, las prácticas de manejo y las condiciones edafoclimáticas, que añaden ruido a la señal asociada con el estado de salud.</w:t>
-      </w:r>
-    </w:p>
-    <w:p>
-      <w:pPr>
-        <w:pStyle w:val="BodyText"/>
-      </w:pPr>
-      <w:r>
-        <w:t xml:space="preserve">Estos hallazgos son consistentes con la literatura reciente sobre microbiomas de fresa, que reporta diferencias taxonómicas específicas entre rizósferas saludables y no saludables (Nam et al., 2023; Siegieda et al., 2024), sin que ello implique diferencias de diversidad globalmente robustas. En conjunto, estos resultados refuerzan la idea de que el estado de salud de un cultivo no se refleja de manera uniforme en toda la comunidad microbiana, sino en subconjuntos taxonómicos específicos, lo que respalda metodológicamente la estrategia de exploración multinivel adoptada en este trabajo frente a un análisis limitado a la comunidad completa.</w:t>
-      </w:r>
-    </w:p>
-    <w:p>
-      <w:pPr>
-        <w:pStyle w:val="BodyText"/>
-      </w:pPr>
-      <w:r>
-        <w:t xml:space="preserve">Desde la perspectiva de la agricultura de precisión, los taxones biomarcadores candidatos, positivos como</w:t>
-      </w:r>
-      <w:r>
-        <w:t xml:space="preserve"> </w:t>
-      </w:r>
-      <w:r>
-        <w:rPr>
-          <w:iCs/>
-          <w:i/>
-        </w:rPr>
-        <w:t xml:space="preserve">Pseudomonas</w:t>
-      </w:r>
-      <w:r>
-        <w:t xml:space="preserve">,</w:t>
-      </w:r>
-      <w:r>
-        <w:t xml:space="preserve"> </w:t>
-      </w:r>
-      <w:r>
-        <w:rPr>
-          <w:iCs/>
-          <w:i/>
-        </w:rPr>
-        <w:t xml:space="preserve">Bacillus</w:t>
-      </w:r>
-      <w:r>
-        <w:t xml:space="preserve"> </w:t>
-      </w:r>
-      <w:r>
-        <w:t xml:space="preserve">y</w:t>
-      </w:r>
-      <w:r>
-        <w:t xml:space="preserve"> </w:t>
-      </w:r>
-      <w:r>
-        <w:rPr>
-          <w:iCs/>
-          <w:i/>
-        </w:rPr>
-        <w:t xml:space="preserve">Paenibacillus polymyxa</w:t>
-      </w:r>
-      <w:r>
-        <w:t xml:space="preserve">, y negativos como</w:t>
+        <w:t xml:space="preserve"> </w:t>
+      </w:r>
+      <w:r>
+        <w:t xml:space="preserve">y de los géneros candidatos reveló diferencias, lo que indica que la señal, si existe, no está en la abundancia de un taxón particular sino en la estructura del conjunto. En segundo lugar, el tamaño de muestra y su desbalance (35 muestras saludables frente a 18 no saludables), junto con la diferencia observada en la profundidad de secuenciación entre grupos, reducen la potencia estadística disponible para detectar diferencias moderadas. En tercer lugar, los microbiomas rizosféricos están sujetos a fuentes de variabilidad no controladas en este estudio, como los lotes de cultivo, las prácticas de manejo y las condiciones edafoclimáticas, que añaden ruido a la señal asociada con el estado de salud.</w:t>
+      </w:r>
+    </w:p>
+    <w:p>
+      <w:pPr>
+        <w:pStyle w:val="BodyText"/>
+      </w:pPr>
+      <w:r>
+        <w:t xml:space="preserve">A diferencia de la literatura reciente sobre microbiomas de fresa, que reporta géneros enriquecidos en rizósferas saludables o no saludables (Nam et al., 2023; Siegieda et al., 2024), en estos datos no se detectó ningún género asociado con una condición. Que</w:t>
       </w:r>
       <w:r>
         <w:t xml:space="preserve"> </w:t>
@@ -2378,52 +2518,34 @@
         <w:t xml:space="preserve">Fusarium</w:t>
       </w:r>
       <w:r>
-        <w:t xml:space="preserve">,</w:t>
-      </w:r>
-      <w:r>
-        <w:t xml:space="preserve"> </w:t>
-      </w:r>
-      <w:r>
-        <w:rPr>
-          <w:iCs/>
-          <w:i/>
-        </w:rPr>
-        <w:t xml:space="preserve">Phytophthora</w:t>
-      </w:r>
-      <w:r>
-        <w:t xml:space="preserve"> </w:t>
-      </w:r>
-      <w:r>
-        <w:t xml:space="preserve">y</w:t>
-      </w:r>
-      <w:r>
-        <w:t xml:space="preserve"> </w:t>
-      </w:r>
-      <w:r>
-        <w:rPr>
-          <w:iCs/>
-          <w:i/>
-        </w:rPr>
-        <w:t xml:space="preserve">Ralstonia</w:t>
-      </w:r>
-      <w:r>
-        <w:t xml:space="preserve">, son un insumo de valor práctico para sistemas de monitoreo temprano de la salud del suelo y para la selección de microorganismos con potencial como bioinsumos o agentes de biocontrol. La principal contribución de este trabajo, sin embargo, no reside en un hallazgo taxonómico aislado, sino en el flujo computacional desarrollado: reproducible, modular y versionado, integra Bash, R, el formato BIOM y phyloseq para ejecutar de manera trazable el control de calidad, el cálculo de la diversidad, la exploración taxonómica multinivel y la validación estadística. Este flujo puede reutilizarse sobre nuevos conjuntos de datos o cultivos y funciona como la capa de ingeniería de características para clasificadores automáticos: las matrices de abundancia aglomeradas por nivel taxonómico que produce son la representación de entrada que requieren los modelos de aprendizaje supervisado.</w:t>
-      </w:r>
-    </w:p>
-    <w:p>
-      <w:pPr>
-        <w:pStyle w:val="BodyText"/>
-      </w:pPr>
-      <w:r>
-        <w:t xml:space="preserve">Este estudio presenta limitaciones que deben considerarse al interpretar sus resultados. El diseño es transversal y se basa en un único cultivo y una única fuente de datos, lo que limita la generalización a otros contextos agroecológicos. El tamaño de muestra es moderado y desbalanceado para pruebas de alta potencia, y no se aplicaron correcciones por comparaciones múltiples al evaluar varios niveles taxonómicos, por lo que los patrones identificados deben interpretarse como hipótesis por confirmar. Adicionalmente, los taxones diferenciadores se identificaron mediante inspección de las abundancias relativas y no mediante pruebas de abundancia diferencial que consideren la naturaleza composicional de los datos. Por último, aunque la diversidad filogenética (por ejemplo, mediante UniFrac) se consideró en el marco teórico del flujo propuesto, no se dispuso de un árbol filogenético asociado con los datos para su cálculo efectivo en este estudio, ya que la clasificación con Kraken proporciona una jerarquía taxonómica pero no longitudes de rama.</w:t>
-      </w:r>
-    </w:p>
-    <w:p>
-      <w:pPr>
-        <w:pStyle w:val="BodyText"/>
-      </w:pPr>
-      <w:r>
-        <w:t xml:space="preserve">Como líneas de trabajo futuro se propone, en primer lugar, la incorporación de modelos de aprendizaje automático supervisado, como los bosques aleatorios, entrenados sobre las abundancias taxonómicas multinivel, para construir clasificadores del estado de salud con mayor capacidad predictiva que los índices agregados. Este tipo de modelo es pertinente en escenarios de alta dimensionalidad y muestra moderada, por su robustez frente al sobreajuste y por sus medidas de importancia de variables, que permitirían priorizar los taxones biomarcadores; su evaluación requeriría validación cruzada y métricas como exactitud, sensibilidad, especificidad y área bajo la curva. En segundo lugar, la ampliación del tamaño de muestra y el uso de diseños longitudinales que permitan observar la dinámica del microbioma durante el desarrollo de la enfermedad. En tercer lugar, la integración de metadatos agronómicos y ambientales y de inferencia funcional (por ejemplo, mediante PICRUSt2; Douglas et al., 2020). Finalmente, la exploración de redes de coocurrencia y de modelos gráficos probabilísticos, como las redes bayesianas, para caracterizar las relaciones de dependencia entre taxones clave, como</w:t>
+        <w:t xml:space="preserve"> </w:t>
+      </w:r>
+      <w:r>
+        <w:t xml:space="preserve">no esté enriquecido en la rizósfera de las plantas marchitas no descarta su papel en la enfermedad: la clasificación con Kraken asigna lecturas al género sin distinguir cepas patógenas, la marchitez puede deberse a otros agentes y la rizósfera no es el tejido donde el patógeno se concentra. En conjunto, estos resultados indican que el estado de salud no se refleja en la abundancia de taxones aislados sino en la variabilidad conjunta de la comunidad, lo que respalda la estrategia de evaluar la dispersión, y no solo las medias, adoptada en este trabajo.</w:t>
+      </w:r>
+    </w:p>
+    <w:p>
+      <w:pPr>
+        <w:pStyle w:val="BodyText"/>
+      </w:pPr>
+      <w:r>
+        <w:t xml:space="preserve">Desde la perspectiva de la agricultura de precisión, la ausencia de géneros biomarcadores en estos datos indica que un sistema de monitoreo temprano de la salud del suelo deberá apoyarse en medidas de la estructura y la estabilidad del conjunto, como la dispersión composicional, más que en la abundancia de taxones individuales. La principal contribución de este trabajo, sin embargo, no reside en un hallazgo taxonómico aislado, sino en el flujo computacional desarrollado: reproducible, modular y versionado, integra Bash, R, el formato BIOM y phyloseq para ejecutar de manera trazable el control de calidad, el cálculo de la diversidad, la exploración taxonómica multinivel y la validación estadística. Este flujo puede reutilizarse sobre nuevos conjuntos de datos o cultivos y funciona como la capa de ingeniería de características para clasificadores automáticos: las matrices de abundancia aglomeradas por nivel taxonómico que produce son la representación de entrada que requieren los modelos de aprendizaje supervisado.</w:t>
+      </w:r>
+    </w:p>
+    <w:p>
+      <w:pPr>
+        <w:pStyle w:val="BodyText"/>
+      </w:pPr>
+      <w:r>
+        <w:t xml:space="preserve">Este estudio presenta limitaciones. El diseño es transversal y se basa en un único cultivo y una única fuente de datos, lo que limita la generalización. El tamaño de muestra es moderado y desbalanceado para pruebas de alta potencia. Las pruebas sobre géneros se limitaron a siete taxones seleccionados por inspección previa, con corrección por comparaciones múltiples, y no a un análisis de abundancia diferencial sobre toda la tabla que considere la naturaleza composicional de los datos. Por último, no se dispuso de un árbol filogenético para calcular la diversidad filogenética (por ejemplo, UniFrac), porque la clasificación con Kraken proporciona una jerarquía taxonómica pero no longitudes de rama.</w:t>
+      </w:r>
+    </w:p>
+    <w:p>
+      <w:pPr>
+        <w:pStyle w:val="BodyText"/>
+      </w:pPr>
+      <w:r>
+        <w:t xml:space="preserve">Como líneas de trabajo futuro se propone, en primer lugar, incorporar modelos de aprendizaje automático supervisado, como los bosques aleatorios, entrenados sobre las abundancias taxonómicas multinivel, que son robustos frente al sobreajuste en escenarios de alta dimensionalidad y muestra moderada, y cuya evaluación requeriría validación cruzada y métricas como exactitud, sensibilidad y área bajo la curva. En segundo lugar, la ampliación del tamaño de muestra y el uso de diseños longitudinales que permitan observar la dinámica del microbioma durante el desarrollo de la enfermedad. En tercer lugar, la integración de metadatos agronómicos y ambientales y de inferencia funcional (por ejemplo, mediante PICRUSt2; Douglas et al., 2020). Finalmente, la exploración de redes de coocurrencia y de modelos gráficos probabilísticos, como las redes bayesianas, para caracterizar las relaciones de dependencia entre taxones clave, como</w:t>
       </w:r>
       <w:r>
         <w:t xml:space="preserve"> </w:t>
@@ -2551,6 +2673,42 @@
           <w:b/>
         </w:rPr>
         <w:t xml:space="preserve">REFERENCIAS BIBLIOGRÁFICAS</w:t>
+      </w:r>
+    </w:p>
+    <w:p>
+      <w:pPr>
+        <w:spacing w:before="0" w:after="60" w:line="360" w:lineRule="auto"/>
+        <w:ind w:left="720" w:hanging="720"/>
+        <w:jc w:val="left"/>
+      </w:pPr>
+      <w:r>
+        <w:t xml:space="preserve">Benjamini, Y., &amp; Hochberg, Y. (1995). Controlling the false discovery rate: a practical and powerful approach to multiple testing.</w:t>
+      </w:r>
+      <w:r>
+        <w:t xml:space="preserve"> </w:t>
+      </w:r>
+      <w:r>
+        <w:rPr>
+          <w:iCs/>
+          <w:i/>
+        </w:rPr>
+        <w:t xml:space="preserve">Journal of the Royal Statistical Society: Series B</w:t>
+      </w:r>
+      <w:r>
+        <w:t xml:space="preserve">,</w:t>
+      </w:r>
+      <w:r>
+        <w:t xml:space="preserve"> </w:t>
+      </w:r>
+      <w:r>
+        <w:rPr>
+          <w:iCs/>
+          <w:i/>
+        </w:rPr>
+        <w:t xml:space="preserve">57</w:t>
+      </w:r>
+      <w:r>
+        <w:t xml:space="preserve">(1), 289–300. https://doi.org/10.1111/j.2517-6161.1995.tb02031.x</w:t>
       </w:r>
     </w:p>
     <w:p>

</xml_diff>